<commit_message>
Release Shiri 1.1.1 with unified tags and complete app documentation
</commit_message>
<xml_diff>
--- a/docs/参赛资料/拾日参赛视频拍摄与剪辑脚本.docx
+++ b/docs/参赛资料/拾日参赛视频拍摄与剪辑脚本.docx
@@ -25,91 +25,37 @@
         </w:rPr>
       </w:pPr>
       <w:r>
-        <w:rPr>
-          <w:color w:val="346AC3"/>
-          <w:sz w:val="22"/>
-          <w:lang w:eastAsia="zh-CN"/>
-        </w:rPr>
-        <w:t xml:space="preserve">完整 48 </w:t>
-      </w:r>
-      <w:proofErr w:type="gramStart"/>
-      <w:r>
-        <w:rPr>
-          <w:color w:val="346AC3"/>
-          <w:sz w:val="22"/>
-          <w:lang w:eastAsia="zh-CN"/>
-        </w:rPr>
-        <w:t>秒片头  ·</w:t>
-      </w:r>
-      <w:proofErr w:type="gramEnd"/>
-      <w:r>
-        <w:rPr>
-          <w:color w:val="346AC3"/>
-          <w:sz w:val="22"/>
-          <w:lang w:eastAsia="zh-CN"/>
-        </w:rPr>
-        <w:t xml:space="preserve">  目标成片 4 分 40 </w:t>
-      </w:r>
-      <w:proofErr w:type="gramStart"/>
-      <w:r>
-        <w:rPr>
-          <w:color w:val="346AC3"/>
-          <w:sz w:val="22"/>
-          <w:lang w:eastAsia="zh-CN"/>
-        </w:rPr>
-        <w:t>秒  ·</w:t>
-      </w:r>
-      <w:proofErr w:type="gramEnd"/>
-      <w:r>
-        <w:rPr>
-          <w:color w:val="346AC3"/>
-          <w:sz w:val="22"/>
-          <w:lang w:eastAsia="zh-CN"/>
-        </w:rPr>
-        <w:t xml:space="preserve">  模拟器实录</w:t>
-      </w:r>
-    </w:p>
-    <w:p>
-      <w:pPr>
-        <w:rPr>
-          <w:lang w:eastAsia="zh-CN"/>
-        </w:rPr>
-      </w:pPr>
-      <w:r>
-        <w:rPr>
-          <w:color w:val="20334D"/>
-          <w:lang w:eastAsia="zh-CN"/>
-        </w:rPr>
-        <w:t>编写日期：2026 年 10 月 10 日。</w:t>
-      </w:r>
-    </w:p>
-    <w:p>
-      <w:pPr>
-        <w:rPr>
-          <w:lang w:eastAsia="zh-CN"/>
-        </w:rPr>
-      </w:pPr>
-      <w:r>
-        <w:rPr>
-          <w:b/>
-          <w:color w:val="20334D"/>
-          <w:lang w:eastAsia="zh-CN"/>
-        </w:rPr>
-        <w:t>确定的安排：48 秒宣传片完整作为开头，后接实际操作与讲解，成片目标 4 分 40 秒。</w:t>
-      </w:r>
-    </w:p>
-    <w:p>
-      <w:pPr>
-        <w:rPr>
-          <w:lang w:eastAsia="zh-CN"/>
-        </w:rPr>
-      </w:pPr>
-      <w:r>
-        <w:rPr>
-          <w:color w:val="20334D"/>
-          <w:lang w:eastAsia="zh-CN"/>
-        </w:rPr>
-        <w:t>视频要求：MP4、3—5 分钟、300MB 以内。4 分 40 秒留有 20 秒余量，避免片尾或转场增加后超过限制。</w:t>
+        <w:t>完整48秒片头 · 既有成片4分52秒 · 1.1.1资料同步</w:t>
+      </w:r>
+    </w:p>
+    <w:p>
+      <w:pPr>
+        <w:rPr>
+          <w:lang w:eastAsia="zh-CN"/>
+        </w:rPr>
+      </w:pPr>
+      <w:r>
+        <w:t>更新日期：2026年10月17日。原拍摄计划编写于2026年10月10日。</w:t>
+      </w:r>
+    </w:p>
+    <w:p>
+      <w:pPr>
+        <w:rPr>
+          <w:lang w:eastAsia="zh-CN"/>
+        </w:rPr>
+      </w:pPr>
+      <w:r>
+        <w:t>成片状态：既有完整版位于 D:/study/Contest/AIC/promo/out/拾日-参赛演示-完整版.mp4。已核对为4分52秒、1920×1080、60fps、H.264/AAC，54,386,609字节；48秒片头完整保留。</w:t>
+      </w:r>
+    </w:p>
+    <w:p>
+      <w:pPr>
+        <w:rPr>
+          <w:lang w:eastAsia="zh-CN"/>
+        </w:rPr>
+      </w:pPr>
+      <w:r>
+        <w:t>视频要求：MP4、3—5分钟、300MB以内。下文4分40秒时间表为原剪辑预算，既有成片实际为4分52秒。补拍后按最终文件重新检查。</w:t>
       </w:r>
     </w:p>
     <w:p>
@@ -153,26 +99,7 @@
         </w:rPr>
       </w:pPr>
       <w:r>
-        <w:rPr>
-          <w:color w:val="20334D"/>
-          <w:lang w:eastAsia="zh-CN"/>
-        </w:rPr>
-        <w:t>本文件是拍摄及剪辑方案，</w:t>
-      </w:r>
-      <w:r>
-        <w:rPr>
-          <w:b/>
-          <w:color w:val="20334D"/>
-          <w:lang w:eastAsia="zh-CN"/>
-        </w:rPr>
-        <w:t>后续实录尚需按下列步骤录制</w:t>
-      </w:r>
-      <w:r>
-        <w:rPr>
-          <w:color w:val="20334D"/>
-          <w:lang w:eastAsia="zh-CN"/>
-        </w:rPr>
-        <w:t>。历史验证证明相近流程已有可用实现，不等于本次换日期后的拍摄已经完成。操作、剪辑和旁白已经合并在本文件中。制作字幕时按最终声音校准。</w:t>
+        <w:t>本文件保留拍摄、操作、剪辑与旁白计划，供复验和补拍。既有成片使用此前录屏，本次更新文档与App版本，没有把旧录屏冒充1.1.1新录制。字幕按最终声音校准。</w:t>
       </w:r>
     </w:p>
     <w:p>
@@ -1401,26 +1328,7 @@
         </w:rPr>
       </w:pPr>
       <w:r>
-        <w:rPr>
-          <w:color w:val="20334D"/>
-          <w:lang w:eastAsia="zh-CN"/>
-        </w:rPr>
-        <w:t>下文给出可直接使用的例子：</w:t>
-      </w:r>
-      <w:r>
-        <w:rPr>
-          <w:b/>
-          <w:color w:val="20334D"/>
-          <w:lang w:eastAsia="zh-CN"/>
-        </w:rPr>
-        <w:t>2026 年 10 月 12 日，周一</w:t>
-      </w:r>
-      <w:r>
-        <w:rPr>
-          <w:color w:val="20334D"/>
-          <w:lang w:eastAsia="zh-CN"/>
-        </w:rPr>
-        <w:t>。如果实际录制时已经过了这个日期，就把课程、任务条件和所有提问里的日期一起改到新的未来日期。日期变了，对应星期和周次也要一起核对。</w:t>
+        <w:t>下文给出可直接使用的例子：2026 年 10 月 19 日，周一。如果实际录制时已经过了这个日期，就把课程、任务条件和所有提问里的日期一起改到新的未来日期。日期变了，对应星期和周次也要一起核对。</w:t>
       </w:r>
     </w:p>
     <w:p>
@@ -1460,11 +1368,7 @@
         </w:rPr>
       </w:pPr>
       <w:r>
-        <w:rPr>
-          <w:color w:val="20334D"/>
-          <w:lang w:eastAsia="zh-CN"/>
-        </w:rPr>
-        <w:t>使用新账号，准备“演示学期（合成数据）”。先核对安装包版本和服务连接。可使用当前构建号 9，录制时注明实际版本；不要用宣传素材的固定时钟替代正常运行。</w:t>
+        <w:t>使用新账号，准备“演示学期（合成数据）”。先核对安装包版本和服务连接。补拍使用1.1.1（构建12），已有录屏注明当时实际版本；不要用宣传素材的固定时钟替代正常运行。</w:t>
       </w:r>
     </w:p>
     <w:p>
@@ -3887,26 +3791,7 @@
         </w:rPr>
       </w:pPr>
       <w:r>
-        <w:rPr>
-          <w:color w:val="20334D"/>
-          <w:lang w:eastAsia="zh-CN"/>
-        </w:rPr>
-        <w:t xml:space="preserve">以下统一用 </w:t>
-      </w:r>
-      <w:r>
-        <w:rPr>
-          <w:b/>
-          <w:color w:val="20334D"/>
-          <w:lang w:eastAsia="zh-CN"/>
-        </w:rPr>
-        <w:t>2026-10-12</w:t>
-      </w:r>
-      <w:r>
-        <w:rPr>
-          <w:color w:val="20334D"/>
-          <w:lang w:eastAsia="zh-CN"/>
-        </w:rPr>
-        <w:t>。录制日期换了，五条和准备数据一起改。</w:t>
+        <w:t>以下统一用 2026-10-19。录制日期换了，五条和准备数据一起改。</w:t>
       </w:r>
     </w:p>
     <w:p>
@@ -3935,12 +3820,7 @@
         </w:rPr>
       </w:pPr>
       <w:r>
-        <w:rPr>
-          <w:color w:val="20334D"/>
-          <w:sz w:val="19"/>
-          <w:lang w:eastAsia="zh-CN"/>
-        </w:rPr>
-        <w:t>请记录：2026年10月12日9:15到A301开项目会议，我确定参加，结束时间还不确定。先给我核对预览。</w:t>
+        <w:t>请记录：2026年10月19日9:15到A301开项目会议，我会参加。先给我核对预览。</w:t>
       </w:r>
     </w:p>
     <w:p>
@@ -3969,12 +3849,7 @@
         </w:rPr>
       </w:pPr>
       <w:r>
-        <w:rPr>
-          <w:color w:val="20334D"/>
-          <w:sz w:val="19"/>
-          <w:lang w:eastAsia="zh-CN"/>
-        </w:rPr>
-        <w:t>补充刚才的项目会议：结束时间是2026年10月12日9:40，其他信息和我记录的请假不变。</w:t>
+        <w:t>补充刚才的项目会议：结束时间是2026年10月19日9:40，其他信息和我记录的请假不变。</w:t>
       </w:r>
     </w:p>
     <w:p>
@@ -4004,12 +3879,7 @@
         </w:rPr>
       </w:pPr>
       <w:r>
-        <w:rPr>
-          <w:color w:val="20334D"/>
-          <w:sz w:val="19"/>
-          <w:lang w:eastAsia="zh-CN"/>
-        </w:rPr>
-        <w:t>把完成实验报告、复习概率论、整理实验数据这三项任务安排在2026年10月12日19点到21点。每项完整30分钟，遵守各自最早开始时间，不改变课程和项目会议，先给我方案。</w:t>
+        <w:t>把完成实验报告、复习概率论、整理实验数据这三项任务安排在2026年10月19日19点到21点。每项完整30分钟，遵守各自最早开始时间，不改变课程和项目会议，先给我方案。</w:t>
       </w:r>
     </w:p>
     <w:p>
@@ -4038,12 +3908,7 @@
         </w:rPr>
       </w:pPr>
       <w:r>
-        <w:rPr>
-          <w:color w:val="20334D"/>
-          <w:sz w:val="19"/>
-          <w:lang w:eastAsia="zh-CN"/>
-        </w:rPr>
-        <w:t>请记录新的项目讨论：2026年10月12日19:30到20:00，地点C101，我确定参加。保留课程和现有学习计划，先给我核对预览。</w:t>
+        <w:t>请记录新的项目讨论：2026年10月19日19:30到20:00，地点C101，我确定参加。保留课程和现有学习计划，先给我核对预览。</w:t>
       </w:r>
     </w:p>
     <w:p>
@@ -6428,11 +6293,7 @@
         </w:rPr>
       </w:pPr>
       <w:r>
-        <w:rPr>
-          <w:color w:val="20334D"/>
-          <w:lang w:eastAsia="zh-CN"/>
-        </w:rPr>
-        <w:t>历史模拟器主线发生在 2026-10-10；本脚本示例改用未来的 2026-10-12，并明确三项任务的最早开始条件，录制前必须重新排练。旧截图可以说明已有验证，不能剪成新日期实录的一部分。</w:t>
+        <w:t>历史模拟器主线发生在 2026-10-10；本脚本示例改用未来的 2026-10-19，并明确三项任务的最早开始条件，录制前必须重新排练。旧截图可以说明已有验证，不能剪成新日期实录的一部分。</w:t>
       </w:r>
     </w:p>
     <w:p>
@@ -6461,6 +6322,29 @@
           <w:lang w:eastAsia="zh-CN"/>
         </w:rPr>
         <w:t>本文件合并了拍摄、操作、剪辑与旁白，正式成片还需要按清单录制、核对并导出。</w:t>
+      </w:r>
+    </w:p>
+    <w:p>
+      <w:pPr>
+        <w:pStyle w:val="1"/>
+      </w:pPr>
+      <w:r>
+        <w:t>1.1.1补拍与核对</w:t>
+      </w:r>
+    </w:p>
+    <w:p>
+      <w:r>
+        <w:t>新版本增加标签自动归类和关联列表。若补拍，可打开“学期 → 标签”，展示组会、座谈会归到会议，点标签查看原事项和跨学期记录。合并后保留原题目和时间，无额外整理提示。</w:t>
+      </w:r>
+    </w:p>
+    <w:p>
+      <w:r>
+        <w:t>主线保留原48秒片头，后接真实App操作。无需把所有功能塞进3—5分钟。系统通知、卡片、课程导入和标签可按重点选择短镜头；每个镜头所说内容都以实际结果为准。</w:t>
+      </w:r>
+    </w:p>
+    <w:p>
+      <w:r>
+        <w:t>完整使用说明与功能清单位于仓库docs目录。已有成片没有展示的新功能，不以字幕叠加冒充实录；如需要覆盖，重新录制对应步骤。</w:t>
       </w:r>
     </w:p>
     <w:sectPr>

</xml_diff>